<commit_message>
docs(report,slides): 19-page report on the PTIT template and 17-slide deck
Report: rewritten ~30% shorter to fit the 20-page limit including cover
(cover on one page, single-spaced TOC, lists and abbreviations on one page,
continuous chapters, 3 figures, tables kept together with their captions);
no em dashes, quotation marks or parenthetical asides in the prose; per-chapter
numbering fixed for references at sentence end. Exported with Word
(reports/to_pdf.sh): 19 pages.

Slides: same builder and design rules as the LinCIR deck (16:9, Helvetica,
white/blue, Morph, text >= 20 pt); large-font figure variants (*_slide.png);
speaker notes per slide; exported with PowerPoint (slides/to_pdf.sh).

Co-Authored-By: Claude Opus 5.5 <noreply@anthropic.com>
</commit_message>
<xml_diff>
--- a/reports/template_ptit.docx
+++ b/reports/template_ptit.docx
@@ -383,7 +383,7 @@
           <w:szCs w:val="32"/>
           <w:lang w:val="vi-VN"/>
         </w:rPr>
-        <w:t>VERIFIER-GUIDED REPAIR: SỬA CHỨNG MINH LEAN 4</w:t>
+        <w:t>VERIFIER-GUIDED REPAIR:</w:t>
       </w:r>
     </w:p>
     <w:p>
@@ -403,7 +403,27 @@
           <w:szCs w:val="32"/>
           <w:lang w:val="vi-VN"/>
         </w:rPr>
-        <w:t>CÓ KIỂM CHỨNG DƯỚI RÀNG BUỘC CHI PHÍ VÀ ĐỘ TRỄ</w:t>
+        <w:t>SỬA CHỨNG MINH LEAN 4 CÓ KIỂM CHỨNG</w:t>
+      </w:r>
+    </w:p>
+    <w:p>
+      <w:pPr>
+        <w:pStyle w:val="BodyText"/>
+        <w:jc w:val="center"/>
+        <w:rPr>
+          <w:b/>
+          <w:sz w:val="32"/>
+          <w:szCs w:val="32"/>
+        </w:rPr>
+      </w:pPr>
+      <w:r>
+        <w:rPr>
+          <w:b/>
+          <w:sz w:val="32"/>
+          <w:szCs w:val="32"/>
+          <w:lang w:val="vi-VN"/>
+        </w:rPr>
+        <w:t>DƯỚI RÀNG BUỘC CHI PHÍ VÀ ĐỘ TRỄ</w:t>
       </w:r>
     </w:p>
     <w:tbl>
@@ -433,6 +453,7 @@
           <w:p>
             <w:pPr>
               <w:pStyle w:val="TableParagraph"/>
+              <w:spacing w:line="276" w:lineRule="auto" w:after="0" w:before="0"/>
               <w:ind w:left="200"/>
               <w:rPr>
                 <w:b/>
@@ -496,6 +517,7 @@
           <w:p>
             <w:pPr>
               <w:pStyle w:val="TableParagraph"/>
+              <w:spacing w:line="276" w:lineRule="auto" w:after="0" w:before="0"/>
               <w:ind w:left="367"/>
               <w:rPr>
                 <w:b/>
@@ -517,6 +539,7 @@
           <w:p>
             <w:pPr>
               <w:pStyle w:val="TableParagraph"/>
+              <w:spacing w:line="276" w:lineRule="auto" w:after="0" w:before="0"/>
               <w:ind w:left="367"/>
               <w:rPr>
                 <w:b/>
@@ -541,6 +564,7 @@
           <w:p>
             <w:pPr>
               <w:pStyle w:val="TableParagraph"/>
+              <w:spacing w:line="276" w:lineRule="auto" w:after="0" w:before="0"/>
               <w:ind w:left="200"/>
               <w:rPr>
                 <w:b/>
@@ -581,6 +605,7 @@
           <w:p>
             <w:pPr>
               <w:pStyle w:val="TableParagraph"/>
+              <w:spacing w:line="276" w:lineRule="auto" w:after="0" w:before="0"/>
               <w:ind w:left="367"/>
               <w:rPr>
                 <w:b/>
@@ -614,7 +639,7 @@
           <w:p>
             <w:pPr>
               <w:pStyle w:val="TableParagraph"/>
-              <w:spacing w:before="93"/>
+              <w:spacing w:before="0" w:line="276" w:lineRule="auto" w:after="0"/>
               <w:ind w:left="200"/>
               <w:rPr>
                 <w:b/>
@@ -655,6 +680,7 @@
           <w:p>
             <w:pPr>
               <w:pStyle w:val="TableParagraph"/>
+              <w:spacing w:line="276" w:lineRule="auto" w:after="0" w:before="0"/>
               <w:ind w:left="367"/>
               <w:rPr>
                 <w:b/>
@@ -687,7 +713,7 @@
           <w:p>
             <w:pPr>
               <w:pStyle w:val="TableParagraph"/>
-              <w:spacing w:before="139"/>
+              <w:spacing w:before="0" w:line="276" w:lineRule="auto" w:after="0"/>
               <w:ind w:left="200"/>
               <w:rPr>
                 <w:b/>
@@ -751,6 +777,7 @@
           <w:p>
             <w:pPr>
               <w:pStyle w:val="TableParagraph"/>
+              <w:spacing w:line="276" w:lineRule="auto" w:after="0" w:before="0"/>
               <w:ind w:left="367"/>
               <w:rPr>
                 <w:b/>
@@ -808,7 +835,7 @@
           </w:tcPr>
           <w:p>
             <w:pPr>
-              <w:spacing w:before="88" w:line="240" w:lineRule="auto"/>
+              <w:spacing w:before="0" w:line="276" w:lineRule="auto" w:after="0"/>
               <w:ind w:right="55"/>
               <w:rPr>
                 <w:szCs w:val="26"/>
@@ -823,7 +850,7 @@
           </w:p>
           <w:p>
             <w:pPr>
-              <w:spacing w:before="88" w:line="240" w:lineRule="auto"/>
+              <w:spacing w:before="0" w:line="276" w:lineRule="auto" w:after="0"/>
               <w:ind w:right="55"/>
               <w:rPr>
                 <w:iCs/>
@@ -852,7 +879,7 @@
           </w:tcPr>
           <w:p>
             <w:pPr>
-              <w:spacing w:before="88" w:line="240" w:lineRule="auto"/>
+              <w:spacing w:before="0" w:line="276" w:lineRule="auto" w:after="0"/>
               <w:ind w:right="55"/>
               <w:rPr>
                 <w:iCs/>
@@ -874,7 +901,9 @@
             <w:proofErr w:type="spellEnd"/>
           </w:p>
           <w:p>
-            <w:pPr/>
+            <w:pPr>
+              <w:spacing w:line="276" w:lineRule="auto" w:after="0" w:before="0"/>
+            </w:pPr>
             <w:r>
               <w:rPr/>
               <w:t>Trần Quang Đức Dũng</w:t>
@@ -893,7 +922,7 @@
           </w:tcPr>
           <w:p>
             <w:pPr>
-              <w:spacing w:before="88" w:line="240" w:lineRule="auto"/>
+              <w:spacing w:before="0" w:line="276" w:lineRule="auto" w:after="0"/>
               <w:ind w:right="55"/>
               <w:rPr>
                 <w:iCs/>
@@ -916,7 +945,9 @@
             <w:proofErr w:type="spellEnd"/>
           </w:p>
           <w:p>
-            <w:pPr/>
+            <w:pPr>
+              <w:spacing w:line="276" w:lineRule="auto" w:after="0" w:before="0"/>
+            </w:pPr>
             <w:r>
               <w:rPr/>
               <w:t>Lâm Thành Trung</w:t>
@@ -930,7 +961,7 @@
           </w:tcPr>
           <w:p>
             <w:pPr>
-              <w:spacing w:before="88" w:line="240" w:lineRule="auto"/>
+              <w:spacing w:before="0" w:line="276" w:lineRule="auto" w:after="0"/>
               <w:ind w:right="55"/>
               <w:rPr>
                 <w:iCs/>
@@ -951,7 +982,9 @@
             <w:proofErr w:type="spellEnd"/>
           </w:p>
           <w:p>
-            <w:pPr/>
+            <w:pPr>
+              <w:spacing w:line="276" w:lineRule="auto" w:after="0" w:before="0"/>
+            </w:pPr>
             <w:r>
               <w:rPr/>
               <w:t>Nguyễn Xuân Tùng</w:t>
@@ -970,7 +1003,7 @@
           </w:tcPr>
           <w:p>
             <w:pPr>
-              <w:spacing w:before="88" w:line="240" w:lineRule="auto"/>
+              <w:spacing w:before="0" w:line="276" w:lineRule="auto" w:after="0"/>
               <w:ind w:right="55"/>
               <w:rPr>
                 <w:iCs/>
@@ -987,7 +1020,9 @@
             <w:proofErr w:type="spellEnd"/>
           </w:p>
           <w:p>
-            <w:pPr/>
+            <w:pPr>
+              <w:spacing w:line="276" w:lineRule="auto" w:after="0" w:before="0"/>
+            </w:pPr>
             <w:r>
               <w:rPr/>
               <w:t>Khamsing OUTHAIHUENG</w:t>
@@ -1001,7 +1036,7 @@
           </w:tcPr>
           <w:p>
             <w:pPr>
-              <w:spacing w:before="88" w:line="240" w:lineRule="auto"/>
+              <w:spacing w:before="0" w:line="276" w:lineRule="auto" w:after="0"/>
               <w:ind w:right="55"/>
               <w:rPr>
                 <w:iCs/>
@@ -1016,7 +1051,9 @@
             </w:r>
           </w:p>
           <w:p>
-            <w:pPr/>
+            <w:pPr>
+              <w:spacing w:line="276" w:lineRule="auto" w:after="0" w:before="0"/>
+            </w:pPr>
             <w:r>
               <w:rPr/>
               <w:t>Mekdala Nounou</w:t>

</xml_diff>